<commit_message>
Site: publish staff one-pager + editable Word agendas
- Add the staff-meeting update one-pager (PDF + Word) as a 'For team leaders'
  download on The Process page (public/handouts).
- Generate editable Word versions of the Meeting 1, 2, and 3 one-page agendas
  and add an 'Agenda (Word)' download button on each meeting page (alongside the
  PDF), via the agendaWord frontmatter field.

Co-Authored-By: Claude Opus 4.8 <noreply@anthropic.com>
</commit_message>
<xml_diff>
--- a/public/agendas/ems-meeting-2-agenda.docx
+++ b/public/agendas/ems-meeting-2-agenda.docx
@@ -101,6 +101,22 @@
     </w:p>
     <w:p>
       <w:pPr>
+        <w:spacing w:after="90" w:before="220"/>
+      </w:pPr>
+      <w:r>
+        <w:rPr>
+          <w:rFonts w:ascii="Calibri" w:cs="Calibri" w:eastAsia="Calibri" w:hAnsi="Calibri"/>
+          <w:b/>
+          <w:bCs/>
+          <w:color w:val="9B2C2C"/>
+          <w:sz w:val="26"/>
+          <w:szCs w:val="26"/>
+        </w:rPr>
+        <w:t xml:space="preserve">Why this meeting matters</w:t>
+      </w:r>
+    </w:p>
+    <w:p>
+      <w:pPr>
         <w:spacing w:after="90"/>
       </w:pPr>
       <w:r>
@@ -110,7 +126,7 @@
           <w:sz w:val="22"/>
           <w:szCs w:val="22"/>
         </w:rPr>
-        <w:t xml:space="preserve">Today your team sets up how it will work — roles first, then norms, then how you'll hold each other to them. Each worksheet ends by handing into the next, so the meeting flows as one connected set. Treat it as a strong first pass.</w:t>
+        <w:t xml:space="preserve">How a team works together shapes everything that follows. Before the content work begins, Meeting 2 builds the team's foundation — who does what, the specific behaviors you commit to, and how you'll hold each other to them — so that when the work gets vulnerable (looking at shared student evidence), the team is ready. Treat today as a strong first pass; you'll finalize at the Meeting 4 buffer.</w:t>
       </w:r>
     </w:p>
     <w:tbl>
@@ -338,7 +354,7 @@
           <w:sz w:val="26"/>
           <w:szCs w:val="26"/>
         </w:rPr>
-        <w:t xml:space="preserve">Agenda</w:t>
+        <w:t xml:space="preserve">Agenda — step by step</w:t>
       </w:r>
     </w:p>
     <w:tbl>
@@ -354,9 +370,8 @@
         </w:tblBorders>
       </w:tblPr>
       <w:tblGrid>
-        <w:gridCol w:w="1310"/>
-        <w:gridCol w:w="5054"/>
-        <w:gridCol w:w="2996"/>
+        <w:gridCol w:w="1404"/>
+        <w:gridCol w:w="7956"/>
       </w:tblGrid>
       <w:tr>
         <w:trPr>
@@ -364,7 +379,7 @@
         </w:trPr>
         <w:tc>
           <w:tcPr>
-            <w:tcW w:type="dxa" w:w="1310"/>
+            <w:tcW w:type="dxa" w:w="1404"/>
             <w:tcBorders>
               <w:top w:val="single" w:color="E2E2E2" w:sz="4"/>
               <w:left w:val="single" w:color="E2E2E2" w:sz="4"/>
@@ -395,7 +410,7 @@
         </w:tc>
         <w:tc>
           <w:tcPr>
-            <w:tcW w:type="dxa" w:w="5054"/>
+            <w:tcW w:type="dxa" w:w="7956"/>
             <w:tcBorders>
               <w:top w:val="single" w:color="E2E2E2" w:sz="4"/>
               <w:left w:val="single" w:color="E2E2E2" w:sz="4"/>
@@ -424,37 +439,6 @@
             </w:r>
           </w:p>
         </w:tc>
-        <w:tc>
-          <w:tcPr>
-            <w:tcW w:type="dxa" w:w="2996"/>
-            <w:tcBorders>
-              <w:top w:val="single" w:color="E2E2E2" w:sz="4"/>
-              <w:left w:val="single" w:color="E2E2E2" w:sz="4"/>
-              <w:bottom w:val="single" w:color="E2E2E2" w:sz="4"/>
-              <w:right w:val="single" w:color="E2E2E2" w:sz="4"/>
-            </w:tcBorders>
-            <w:shd w:fill="9B2C2C" w:color="auto" w:val="clear"/>
-            <w:tcMar>
-              <w:top w:type="dxa" w:w="60"/>
-              <w:left w:type="dxa" w:w="100"/>
-              <w:bottom w:type="dxa" w:w="60"/>
-              <w:right w:type="dxa" w:w="100"/>
-            </w:tcMar>
-          </w:tcPr>
-          <w:p>
-            <w:r>
-              <w:rPr>
-                <w:rFonts w:ascii="Calibri" w:cs="Calibri" w:eastAsia="Calibri" w:hAnsi="Calibri"/>
-                <w:b/>
-                <w:bCs/>
-                <w:color w:val="FFFFFF"/>
-                <w:sz w:val="20"/>
-                <w:szCs w:val="20"/>
-              </w:rPr>
-              <w:t xml:space="preserve">Worksheet to use</w:t>
-            </w:r>
-          </w:p>
-        </w:tc>
       </w:tr>
       <w:tr>
         <w:trPr>
@@ -462,7 +446,7 @@
         </w:trPr>
         <w:tc>
           <w:tcPr>
-            <w:tcW w:type="dxa" w:w="1310"/>
+            <w:tcW w:type="dxa" w:w="1404"/>
             <w:tcBorders>
               <w:top w:val="single" w:color="E2E2E2" w:sz="4"/>
               <w:left w:val="single" w:color="E2E2E2" w:sz="4"/>
@@ -493,7 +477,7 @@
         </w:tc>
         <w:tc>
           <w:tcPr>
-            <w:tcW w:type="dxa" w:w="5054"/>
+            <w:tcW w:type="dxa" w:w="7956"/>
             <w:tcBorders>
               <w:top w:val="single" w:color="E2E2E2" w:sz="4"/>
               <w:left w:val="single" w:color="E2E2E2" w:sz="4"/>
@@ -515,35 +499,7 @@
                 <w:sz w:val="22"/>
                 <w:szCs w:val="22"/>
               </w:rPr>
-              <w:t xml:space="preserve">Frame the flow — name the three parts and revisit your Meeting 1 commitment.</w:t>
-            </w:r>
-          </w:p>
-        </w:tc>
-        <w:tc>
-          <w:tcPr>
-            <w:tcW w:type="dxa" w:w="2996"/>
-            <w:tcBorders>
-              <w:top w:val="single" w:color="E2E2E2" w:sz="4"/>
-              <w:left w:val="single" w:color="E2E2E2" w:sz="4"/>
-              <w:bottom w:val="single" w:color="E2E2E2" w:sz="4"/>
-              <w:right w:val="single" w:color="E2E2E2" w:sz="4"/>
-            </w:tcBorders>
-            <w:tcMar>
-              <w:top w:type="dxa" w:w="60"/>
-              <w:left w:type="dxa" w:w="100"/>
-              <w:bottom w:type="dxa" w:w="60"/>
-              <w:right w:type="dxa" w:w="100"/>
-            </w:tcMar>
-          </w:tcPr>
-          <w:p>
-            <w:r>
-              <w:rPr>
-                <w:rFonts w:ascii="Calibri" w:cs="Calibri" w:eastAsia="Calibri" w:hAnsi="Calibri"/>
-                <w:color w:val="1F2933"/>
-                <w:sz w:val="22"/>
-                <w:szCs w:val="22"/>
-              </w:rPr>
-              <w:t xml:space="preserve">—</w:t>
+              <w:t xml:space="preserve">Frame the flow — name the three parts and revisit the why and the shift you named in Meeting 1.</w:t>
             </w:r>
           </w:p>
         </w:tc>
@@ -554,7 +510,7 @@
         </w:trPr>
         <w:tc>
           <w:tcPr>
-            <w:tcW w:type="dxa" w:w="1310"/>
+            <w:tcW w:type="dxa" w:w="1404"/>
             <w:tcBorders>
               <w:top w:val="single" w:color="E2E2E2" w:sz="4"/>
               <w:left w:val="single" w:color="E2E2E2" w:sz="4"/>
@@ -585,7 +541,7 @@
         </w:tc>
         <w:tc>
           <w:tcPr>
-            <w:tcW w:type="dxa" w:w="5054"/>
+            <w:tcW w:type="dxa" w:w="7956"/>
             <w:tcBorders>
               <w:top w:val="single" w:color="E2E2E2" w:sz="4"/>
               <w:left w:val="single" w:color="E2E2E2" w:sz="4"/>
@@ -607,35 +563,7 @@
                 <w:sz w:val="22"/>
                 <w:szCs w:val="22"/>
               </w:rPr>
-              <w:t xml:space="preserve">Assign roles — facilitator / team leader, recorder, and timekeeper, with backups.</w:t>
-            </w:r>
-          </w:p>
-        </w:tc>
-        <w:tc>
-          <w:tcPr>
-            <w:tcW w:type="dxa" w:w="2996"/>
-            <w:tcBorders>
-              <w:top w:val="single" w:color="E2E2E2" w:sz="4"/>
-              <w:left w:val="single" w:color="E2E2E2" w:sz="4"/>
-              <w:bottom w:val="single" w:color="E2E2E2" w:sz="4"/>
-              <w:right w:val="single" w:color="E2E2E2" w:sz="4"/>
-            </w:tcBorders>
-            <w:tcMar>
-              <w:top w:type="dxa" w:w="60"/>
-              <w:left w:type="dxa" w:w="100"/>
-              <w:bottom w:type="dxa" w:w="60"/>
-              <w:right w:type="dxa" w:w="100"/>
-            </w:tcMar>
-          </w:tcPr>
-          <w:p>
-            <w:r>
-              <w:rPr>
-                <w:rFonts w:ascii="Calibri" w:cs="Calibri" w:eastAsia="Calibri" w:hAnsi="Calibri"/>
-                <w:color w:val="1F2933"/>
-                <w:sz w:val="22"/>
-                <w:szCs w:val="22"/>
-              </w:rPr>
-              <w:t xml:space="preserve">Worksheet 1 · Team Roles</w:t>
+              <w:t xml:space="preserve">Assign roles (Team Roles worksheet) — facilitator / team leader, recorder, and timekeeper, with backups. Small teams double up; larger teams add roles.</w:t>
             </w:r>
           </w:p>
         </w:tc>
@@ -646,7 +574,7 @@
         </w:trPr>
         <w:tc>
           <w:tcPr>
-            <w:tcW w:type="dxa" w:w="1310"/>
+            <w:tcW w:type="dxa" w:w="1404"/>
             <w:tcBorders>
               <w:top w:val="single" w:color="E2E2E2" w:sz="4"/>
               <w:left w:val="single" w:color="E2E2E2" w:sz="4"/>
@@ -677,7 +605,7 @@
         </w:tc>
         <w:tc>
           <w:tcPr>
-            <w:tcW w:type="dxa" w:w="5054"/>
+            <w:tcW w:type="dxa" w:w="7956"/>
             <w:tcBorders>
               <w:top w:val="single" w:color="E2E2E2" w:sz="4"/>
               <w:left w:val="single" w:color="E2E2E2" w:sz="4"/>
@@ -699,35 +627,7 @@
                 <w:sz w:val="22"/>
                 <w:szCs w:val="22"/>
               </w:rPr>
-              <w:t xml:space="preserve">Write norms — turn vague values into 4–6 specific, observable “We will…” commitments.</w:t>
-            </w:r>
-          </w:p>
-        </w:tc>
-        <w:tc>
-          <w:tcPr>
-            <w:tcW w:type="dxa" w:w="2996"/>
-            <w:tcBorders>
-              <w:top w:val="single" w:color="E2E2E2" w:sz="4"/>
-              <w:left w:val="single" w:color="E2E2E2" w:sz="4"/>
-              <w:bottom w:val="single" w:color="E2E2E2" w:sz="4"/>
-              <w:right w:val="single" w:color="E2E2E2" w:sz="4"/>
-            </w:tcBorders>
-            <w:tcMar>
-              <w:top w:type="dxa" w:w="60"/>
-              <w:left w:type="dxa" w:w="100"/>
-              <w:bottom w:type="dxa" w:w="60"/>
-              <w:right w:type="dxa" w:w="100"/>
-            </w:tcMar>
-          </w:tcPr>
-          <w:p>
-            <w:r>
-              <w:rPr>
-                <w:rFonts w:ascii="Calibri" w:cs="Calibri" w:eastAsia="Calibri" w:hAnsi="Calibri"/>
-                <w:color w:val="1F2933"/>
-                <w:sz w:val="22"/>
-                <w:szCs w:val="22"/>
-              </w:rPr>
-              <w:t xml:space="preserve">Worksheet 2 · Developing Specific Norms</w:t>
+              <w:t xml:space="preserve">Write specific norms (Developing Specific Norms worksheet) — turn vague values into 4–6 observable “We will…” commitments. This is the big one; take the time. The Sample Team Norms and Developing Specific Actions sheets give models to borrow.</w:t>
             </w:r>
           </w:p>
         </w:tc>
@@ -738,7 +638,7 @@
         </w:trPr>
         <w:tc>
           <w:tcPr>
-            <w:tcW w:type="dxa" w:w="1310"/>
+            <w:tcW w:type="dxa" w:w="1404"/>
             <w:tcBorders>
               <w:top w:val="single" w:color="E2E2E2" w:sz="4"/>
               <w:left w:val="single" w:color="E2E2E2" w:sz="4"/>
@@ -769,7 +669,7 @@
         </w:tc>
         <w:tc>
           <w:tcPr>
-            <w:tcW w:type="dxa" w:w="5054"/>
+            <w:tcW w:type="dxa" w:w="7956"/>
             <w:tcBorders>
               <w:top w:val="single" w:color="E2E2E2" w:sz="4"/>
               <w:left w:val="single" w:color="E2E2E2" w:sz="4"/>
@@ -791,35 +691,7 @@
                 <w:sz w:val="22"/>
                 <w:szCs w:val="22"/>
               </w:rPr>
-              <w:t xml:space="preserve">Set up accountability — agree your protocol and practice one move.</w:t>
-            </w:r>
-          </w:p>
-        </w:tc>
-        <w:tc>
-          <w:tcPr>
-            <w:tcW w:type="dxa" w:w="2996"/>
-            <w:tcBorders>
-              <w:top w:val="single" w:color="E2E2E2" w:sz="4"/>
-              <w:left w:val="single" w:color="E2E2E2" w:sz="4"/>
-              <w:bottom w:val="single" w:color="E2E2E2" w:sz="4"/>
-              <w:right w:val="single" w:color="E2E2E2" w:sz="4"/>
-            </w:tcBorders>
-            <w:tcMar>
-              <w:top w:type="dxa" w:w="60"/>
-              <w:left w:type="dxa" w:w="100"/>
-              <w:bottom w:type="dxa" w:w="60"/>
-              <w:right w:type="dxa" w:w="100"/>
-            </w:tcMar>
-          </w:tcPr>
-          <w:p>
-            <w:r>
-              <w:rPr>
-                <w:rFonts w:ascii="Calibri" w:cs="Calibri" w:eastAsia="Calibri" w:hAnsi="Calibri"/>
-                <w:color w:val="1F2933"/>
-                <w:sz w:val="22"/>
-                <w:szCs w:val="22"/>
-              </w:rPr>
-              <w:t xml:space="preserve">Worksheet 3 · Holding Each Other Accountable</w:t>
+              <w:t xml:space="preserve">Set up accountability (Holding Each Other Accountable worksheet) — agree your protocol and practice one move. A first pass is fine.</w:t>
             </w:r>
           </w:p>
         </w:tc>
@@ -830,7 +702,7 @@
         </w:trPr>
         <w:tc>
           <w:tcPr>
-            <w:tcW w:type="dxa" w:w="1310"/>
+            <w:tcW w:type="dxa" w:w="1404"/>
             <w:tcBorders>
               <w:top w:val="single" w:color="E2E2E2" w:sz="4"/>
               <w:left w:val="single" w:color="E2E2E2" w:sz="4"/>
@@ -861,7 +733,7 @@
         </w:tc>
         <w:tc>
           <w:tcPr>
-            <w:tcW w:type="dxa" w:w="5054"/>
+            <w:tcW w:type="dxa" w:w="7956"/>
             <w:tcBorders>
               <w:top w:val="single" w:color="E2E2E2" w:sz="4"/>
               <w:left w:val="single" w:color="E2E2E2" w:sz="4"/>
@@ -883,35 +755,7 @@
                 <w:sz w:val="22"/>
                 <w:szCs w:val="22"/>
               </w:rPr>
-              <w:t xml:space="preserve">Hand off — note what to finalize at the Meeting 4 buffer.</w:t>
-            </w:r>
-          </w:p>
-        </w:tc>
-        <w:tc>
-          <w:tcPr>
-            <w:tcW w:type="dxa" w:w="2996"/>
-            <w:tcBorders>
-              <w:top w:val="single" w:color="E2E2E2" w:sz="4"/>
-              <w:left w:val="single" w:color="E2E2E2" w:sz="4"/>
-              <w:bottom w:val="single" w:color="E2E2E2" w:sz="4"/>
-              <w:right w:val="single" w:color="E2E2E2" w:sz="4"/>
-            </w:tcBorders>
-            <w:tcMar>
-              <w:top w:type="dxa" w:w="60"/>
-              <w:left w:type="dxa" w:w="100"/>
-              <w:bottom w:type="dxa" w:w="60"/>
-              <w:right w:type="dxa" w:w="100"/>
-            </w:tcMar>
-          </w:tcPr>
-          <w:p>
-            <w:r>
-              <w:rPr>
-                <w:rFonts w:ascii="Calibri" w:cs="Calibri" w:eastAsia="Calibri" w:hAnsi="Calibri"/>
-                <w:color w:val="1F2933"/>
-                <w:sz w:val="22"/>
-                <w:szCs w:val="22"/>
-              </w:rPr>
-              <w:t xml:space="preserve">—</w:t>
+              <w:t xml:space="preserve">Hand off — note what still needs finalizing at the Meeting 4 buffer.</w:t>
             </w:r>
           </w:p>
         </w:tc>
@@ -930,7 +774,7 @@
           <w:sz w:val="18"/>
           <w:szCs w:val="18"/>
         </w:rPr>
-        <w:t xml:space="preserve">The three worksheets are a set: Team Roles → Developing Specific Norms → Holding Each Other Accountable. Each one ends with a “Leave with → next step” that carries into the one after it.</w:t>
+        <w:t xml:space="preserve">The three worksheets are a set: Team Roles → Developing Specific Norms → Holding Each Other Accountable. Each ends with a handoff into the next.</w:t>
       </w:r>
     </w:p>
     <w:p>
@@ -990,7 +834,7 @@
                 <w:sz w:val="24"/>
                 <w:szCs w:val="24"/>
               </w:rPr>
-              <w:t xml:space="preserve">Finalize at the Meeting 4 buffer</w:t>
+              <w:t xml:space="preserve">Where we're going next → Meeting 3</w:t>
             </w:r>
           </w:p>
           <w:p>
@@ -1001,7 +845,7 @@
                 <w:sz w:val="22"/>
                 <w:szCs w:val="22"/>
               </w:rPr>
-              <w:t xml:space="preserve">Today is a first pass. At Meeting 4, teams refine their roles and norms and complete the Holding Each Other Accountable worksheet — so the way you work is settled before the learning cycle begins. (Your Collaborative Team Rubric baseline happens at Meeting 3.)</w:t>
+              <w:t xml:space="preserve">Meeting 3 is Team Self-Assessment: your team baselines how it's functioning on the Collaborative Team Rubric — a mirror, not a grade — and names one area to grow this cycle.</w:t>
             </w:r>
           </w:p>
         </w:tc>
@@ -1023,7 +867,7 @@
           <w:sz w:val="15"/>
           <w:szCs w:val="15"/>
         </w:rPr>
-        <w:t xml:space="preserve">Elsinore Middle School Professional Learning Teams · 2026–27 · Meeting 2 one-page agenda.</w:t>
+        <w:t xml:space="preserve">Elsinore Middle School Professional Learning Teams · 2026–27 · Meeting 2 agenda.</w:t>
       </w:r>
     </w:p>
     <w:sectPr>

</xml_diff>